<commit_message>
Preserve original prototype and fix AI disclosure provenance claim
Add original/ (the 2023 hand-written comp_funcs.py and notebook the
surveymatch package extends) so the AI disclosure section's reference to
it points to something real in the repo, and re-render the paper.

Co-Authored-By: Claude Sonnet 5 <noreply@anthropic.com>
Claude-Session: https://claude.ai/code/session_01Ar4iRenRi3pPn47LtJ4ZzZ
</commit_message>
<xml_diff>
--- a/paper.docx
+++ b/paper.docx
@@ -6792,19 +6792,22 @@
         <w:t xml:space="preserve"> </w:t>
       </w:r>
       <w:r>
-        <w:t xml:space="preserve">(</w:t>
+        <w:t xml:space="preserve">(preserved with no AI involvement under</w:t>
+      </w:r>
+      <w:r>
+        <w:t xml:space="preserve"> </w:t>
       </w:r>
       <w:r>
         <w:rPr>
           <w:rStyle w:val="VerbatimChar"/>
         </w:rPr>
-        <w:t xml:space="preserve">comp_funcs.py</w:t>
-      </w:r>
-      <w:r>
-        <w:t xml:space="preserve"> </w:t>
-      </w:r>
-      <w:r>
-        <w:t xml:space="preserve">and the accompanying notebook, linked from the repository),</w:t>
+        <w:t xml:space="preserve">original/</w:t>
+      </w:r>
+      <w:r>
+        <w:t xml:space="preserve"> </w:t>
+      </w:r>
+      <w:r>
+        <w:t xml:space="preserve">in this repository),</w:t>
       </w:r>
       <w:r>
         <w:t xml:space="preserve"> </w:t>

</xml_diff>